<commit_message>
Brief description of changes
</commit_message>
<xml_diff>
--- a/app_updates.docx
+++ b/app_updates.docx
@@ -137,19 +137,7 @@
         <w:t xml:space="preserve">Added </w:t>
       </w:r>
       <w:r>
-        <w:t xml:space="preserve">new features to the </w:t>
-      </w:r>
-      <w:r>
-        <w:t>peak integration section</w:t>
-      </w:r>
-      <w:r>
-        <w:t xml:space="preserve"> of</w:t>
-      </w:r>
-      <w:r>
-        <w:t xml:space="preserve"> </w:t>
-      </w:r>
-      <w:r>
-        <w:t xml:space="preserve">AKTA tool: </w:t>
+        <w:t xml:space="preserve">new features to the peak integration section of AKTA tool: </w:t>
       </w:r>
     </w:p>
     <w:p>
@@ -209,8 +197,13 @@
       <w:r>
         <w:t xml:space="preserve">default to those in </w:t>
       </w:r>
-      <w:r>
-        <w:t>Mehmethans calibration excel file</w:t>
+      <w:proofErr w:type="spellStart"/>
+      <w:r>
+        <w:t>Mehmethans</w:t>
+      </w:r>
+      <w:proofErr w:type="spellEnd"/>
+      <w:r>
+        <w:t xml:space="preserve"> calibration excel file</w:t>
       </w:r>
       <w:r>
         <w:t>)</w:t>
@@ -338,6 +331,49 @@
       </w:r>
       <w:r>
         <w:t xml:space="preserve">QC run at a time </w:t>
+      </w:r>
+    </w:p>
+    <w:p>
+      <w:pPr>
+        <w:pStyle w:val="ListParagraph"/>
+        <w:numPr>
+          <w:ilvl w:val="0"/>
+          <w:numId w:val="1"/>
+        </w:numPr>
+        <w:rPr>
+          <w:b/>
+          <w:bCs/>
+          <w:u w:val="single"/>
+        </w:rPr>
+      </w:pPr>
+      <w:r>
+        <w:t xml:space="preserve">Changed the contour tool to now automatically </w:t>
+      </w:r>
+      <w:r>
+        <w:t xml:space="preserve">plot all </w:t>
+      </w:r>
+      <w:proofErr w:type="spellStart"/>
+      <w:r>
+        <w:t>dFdT</w:t>
+      </w:r>
+      <w:proofErr w:type="spellEnd"/>
+      <w:r>
+        <w:t xml:space="preserve"> data points (from </w:t>
+      </w:r>
+      <w:r>
+        <w:t>25.5 °C</w:t>
+      </w:r>
+      <w:r>
+        <w:t xml:space="preserve"> to </w:t>
+      </w:r>
+      <w:r>
+        <w:t>89.5 °C</w:t>
+      </w:r>
+      <w:r>
+        <w:t>)</w:t>
+      </w:r>
+      <w:r>
+        <w:t xml:space="preserve">, and added a drop-down box to manually change the y-axis range if necessary  </w:t>
       </w:r>
     </w:p>
     <w:sectPr>

</xml_diff>